<commit_message>
docs: refonte des diagrammes UML classes et MERISE (MCD, MLD, MPD)
Diagramme de classes réorganisé sans chevauchement (services IA et
composants React regroupés dans un cadre dédié, doublons supprimés).
MCD, MLD et MPD refaits en SVG propres et cohérents avec le dictionnaire
de données ; les figures du document MERISE sont régénérées et un
nouveau schéma MPD (types et contraintes SGBD) est ajouté en Figure 3.
</commit_message>
<xml_diff>
--- a/Document/Conception_BDD_MERISE_Islem_BEN_HAMIDA.docx
+++ b/Document/Conception_BDD_MERISE_Islem_BEN_HAMIDA.docx
@@ -293,7 +293,7 @@
       <w:r>
         <w:drawing>
           <wp:inline distT="0" distB="0" distL="0" distR="0">
-            <wp:extent cx="5334000" cy="2609850"/>
+            <wp:extent cx="5334000" cy="2560320"/>
             <wp:effectExtent t="0" r="0" b="0" l="0"/>
             <wp:docPr id="1" name="" descr="" title=""/>
             <wp:cNvGraphicFramePr>
@@ -318,7 +318,7 @@
                   <pic:spPr bwMode="auto">
                     <a:xfrm>
                       <a:off x="0" y="0"/>
-                      <a:ext cx="5334000" cy="2609850"/>
+                      <a:ext cx="5334000" cy="2560320"/>
                     </a:xfrm>
                     <a:prstGeom prst="rect">
                       <a:avLst/>
@@ -510,7 +510,7 @@
       <w:r>
         <w:drawing>
           <wp:inline distT="0" distB="0" distL="0" distR="0">
-            <wp:extent cx="5334000" cy="3371850"/>
+            <wp:extent cx="5334000" cy="3379816"/>
             <wp:effectExtent t="0" r="0" b="0" l="0"/>
             <wp:docPr id="1" name="" descr="" title=""/>
             <wp:cNvGraphicFramePr>
@@ -535,7 +535,7 @@
                   <pic:spPr bwMode="auto">
                     <a:xfrm>
                       <a:off x="0" y="0"/>
-                      <a:ext cx="5334000" cy="3371850"/>
+                      <a:ext cx="5334000" cy="3379816"/>
                     </a:xfrm>
                     <a:prstGeom prst="rect">
                       <a:avLst/>
@@ -705,6 +705,69 @@
           <w:rFonts w:ascii="Arial" w:cs="Arial" w:eastAsia="Arial" w:hAnsi="Arial"/>
         </w:rPr>
         <w:t xml:space="preserve">Le MPD traduit le MLD pour un SGBD relationnel (exemple : MySQL / PostgreSQL). Il précise les types, la nullité, les clés et les contraintes d'intégrité.</w:t>
+      </w:r>
+    </w:p>
+    <w:p>
+      <w:pPr>
+        <w:spacing w:after="60" w:before="80"/>
+        <w:jc w:val="center"/>
+      </w:pPr>
+      <w:r>
+        <w:drawing>
+          <wp:inline distT="0" distB="0" distL="0" distR="0">
+            <wp:extent cx="5334000" cy="3510742"/>
+            <wp:effectExtent t="0" r="0" b="0" l="0"/>
+            <wp:docPr id="1" name="" descr="" title=""/>
+            <wp:cNvGraphicFramePr>
+              <a:graphicFrameLocks xmlns:a="http://schemas.openxmlformats.org/drawingml/2006/main" noChangeAspect="1"/>
+            </wp:cNvGraphicFramePr>
+            <a:graphic xmlns:a="http://schemas.openxmlformats.org/drawingml/2006/main">
+              <a:graphicData uri="http://schemas.openxmlformats.org/drawingml/2006/picture">
+                <pic:pic xmlns:pic="http://schemas.openxmlformats.org/drawingml/2006/picture">
+                  <pic:nvPicPr>
+                    <pic:cNvPr id="0" name="" descr=""/>
+                    <pic:cNvPicPr>
+                      <a:picLocks noChangeAspect="1" noChangeArrowheads="1"/>
+                    </pic:cNvPicPr>
+                  </pic:nvPicPr>
+                  <pic:blipFill>
+                    <a:blip r:embed="rId12" cstate="none"/>
+                    <a:srcRect/>
+                    <a:stretch>
+                      <a:fillRect/>
+                    </a:stretch>
+                  </pic:blipFill>
+                  <pic:spPr bwMode="auto">
+                    <a:xfrm>
+                      <a:off x="0" y="0"/>
+                      <a:ext cx="5334000" cy="3510742"/>
+                    </a:xfrm>
+                    <a:prstGeom prst="rect">
+                      <a:avLst/>
+                    </a:prstGeom>
+                  </pic:spPr>
+                </pic:pic>
+              </a:graphicData>
+            </a:graphic>
+          </wp:inline>
+        </w:drawing>
+      </w:r>
+    </w:p>
+    <w:p>
+      <w:pPr>
+        <w:spacing w:after="160"/>
+        <w:jc w:val="center"/>
+      </w:pPr>
+      <w:r>
+        <w:rPr>
+          <w:rFonts w:ascii="Arial" w:cs="Arial" w:eastAsia="Arial" w:hAnsi="Arial"/>
+          <w:i/>
+          <w:iCs/>
+          <w:color w:val="5C6B7C"/>
+          <w:sz w:val="17"/>
+          <w:szCs w:val="17"/>
+        </w:rPr>
+        <w:t xml:space="preserve">Figure 3 — Modèle physique de données (schéma SGBD, types et contraintes)</w:t>
       </w:r>
     </w:p>
     <w:p>

</xml_diff>